<commit_message>
docs: registrar prompts, supervision humana y declaracion de transparencia en Informe Ejecutivo de IA
</commit_message>
<xml_diff>
--- a/docs/Informe_Ejecutivo_Lineamientos_IA_USC.docx
+++ b/docs/Informe_Ejecutivo_Lineamientos_IA_USC.docx
@@ -35,7 +35,7 @@
           <w:color w:val="646464"/>
           <w:sz w:val="22"/>
         </w:rPr>
-        <w:t>Análisis Operativo y Directrices de la Circular Normativa DGI No. 001 de 2025</w:t>
+        <w:t>Con Declaración Institucional de Transparencia y Registro de Prompts del Proyecto PETI</w:t>
         <w:br/>
       </w:r>
     </w:p>
@@ -201,7 +201,7 @@
         <w:spacing w:line="276" w:lineRule="auto"/>
       </w:pPr>
       <w:r>
-        <w:t>Ante la disrupción acelerada de las tecnologías cognitivas y los modelos fundacionales de Inteligencia Artificial Generativa (IA), la USC asume un liderazgo proactivo al establecer un marco de gobernanza que busca maximizar las oportunidades pedagógicas, investigativas y de eficiencia administrativa de la IA, salvaguardando la integridad académica, la ética científica, la propiedad intelectual y la protección de datos personales.</w:t>
+        <w:t>Ante la disrupción acelerada de las tecnologías cognitivas y los modelos de IA Generativa, la USC establece un marco de gobernanza que busca maximizar las oportunidades formativas de la IA salvaguardando la integridad académica, la ética y la protección de datos personales. En estricto cumplimiento del Artículo 3, numeral 6 de las Directrices para Estudiantes y del numeral 5 de Docentes (deber de transparencia y declaración de comandos), este informe incorpora en su sección final el registro sistemático de prompts, comandos y validaciones humanas aplicadas en el proyecto PETI de Perficient.</w:t>
       </w:r>
     </w:p>
     <w:p>
@@ -225,7 +225,7 @@
         <w:spacing w:line="276" w:lineRule="auto"/>
       </w:pPr>
       <w:r>
-        <w:t>La regulación del uso de la Inteligencia Artificial en la USC se articula armónicamente con marcos normativos de vanguardia:</w:t>
+        <w:t>La regulación de la IA en la USC se articula armónicamente con marcos de política pública de vanguardia:</w:t>
       </w:r>
     </w:p>
     <w:p>
@@ -240,7 +240,7 @@
         <w:t xml:space="preserve">Nivel Global (AI Act de la UE 2023-2024): </w:t>
       </w:r>
       <w:r>
-        <w:t>Clasificación de IA basada en riesgos, exigencias de explicabilidad, supervisión humana y mitigación de sesgos algorítmicos.</w:t>
+        <w:t>Clasificación basada en riesgo, supervisión humana, transparencia y prevención de sesgos algorítmicos.</w:t>
       </w:r>
     </w:p>
     <w:p>
@@ -255,7 +255,7 @@
         <w:t xml:space="preserve">Nivel Nacional (CONPES 4144 de Febrero de 2025): </w:t>
       </w:r>
       <w:r>
-        <w:t>Política Nacional de Inteligencia Artificial de Colombia y la Hoja de Ruta de MinCiencias (2024), promoviendo la ética y la soberanía tecnológica.</w:t>
+        <w:t>Política Nacional de Inteligencia Artificial de Colombia y la Hoja de Ruta de MinCiencias (2024).</w:t>
       </w:r>
     </w:p>
     <w:p>
@@ -270,7 +270,7 @@
         <w:t xml:space="preserve">Leyes Colombianas de Protección de Datos: </w:t>
       </w:r>
       <w:r>
-        <w:t>Ley Estatutaria 1581 de 2012 (Habeas Data) y Ley 1273 de 2009 (Protección de la Información y Delitos Informáticos).</w:t>
+        <w:t>Ley 1581 de 2012 (Habeas Data) y Ley 1273 de 2009 (Protección de la Información y Ciberseguridad).</w:t>
       </w:r>
     </w:p>
     <w:p>
@@ -285,7 +285,7 @@
         <w:t xml:space="preserve">Nivel Institucional USC: </w:t>
       </w:r>
       <w:r>
-        <w:t>Circular Normativa DGI No. 001 (4 de agosto de 2025), de cumplimiento obligatorio para todas las facultades, sedes y seccionales.</w:t>
+        <w:t>Circular Normativa DGI No. 001 (4 de agosto de 2025) que rige para todas las sedes y seccionales.</w:t>
       </w:r>
     </w:p>
     <w:p>
@@ -418,7 +418,7 @@
               <w:rPr>
                 <w:sz w:val="17"/>
               </w:rPr>
-              <w:t>Aprendizaje adaptativo, motivación y retroalimentación formativa en tiempo real.</w:t>
+              <w:t>Aprendizaje adaptativo, motivación y retroalimentación formativa.</w:t>
             </w:r>
           </w:p>
         </w:tc>
@@ -461,7 +461,7 @@
               <w:rPr>
                 <w:sz w:val="17"/>
               </w:rPr>
-              <w:t>Minería de literatura, procesamiento Big Data, modelado predictivo, detección de similitud (Turnitin).</w:t>
+              <w:t>Minería de literatura, procesamiento Big Data, modelado predictivo, Turnitin.</w:t>
             </w:r>
           </w:p>
         </w:tc>
@@ -517,7 +517,7 @@
               <w:rPr>
                 <w:sz w:val="17"/>
               </w:rPr>
-              <w:t>Digitalización de trámites, chatbots de atención, analítica predictiva de deserción estudiantil.</w:t>
+              <w:t>Digitalización de trámites, chatbots de atención, analítica de deserción estudiantil.</w:t>
             </w:r>
           </w:p>
         </w:tc>
@@ -530,7 +530,7 @@
               <w:rPr>
                 <w:sz w:val="17"/>
               </w:rPr>
-              <w:t>Reducción de tiempos, descongestión operativa y atención 24/7 de calidad.</w:t>
+              <w:t>Reducción de tiempos, descongestión operativa y atención 24/7.</w:t>
             </w:r>
           </w:p>
         </w:tc>
@@ -588,7 +588,7 @@
         <w:t xml:space="preserve">1. Exploración con sentido crítico: </w:t>
       </w:r>
       <w:r>
-        <w:t>Investigar cómo la IA impacta su disciplina académica y el mercado laboral con actitud analítica.</w:t>
+        <w:t>Investigar cómo la IA impacta su disciplina académica con actitud analítica.</w:t>
       </w:r>
     </w:p>
     <w:p>
@@ -618,7 +618,7 @@
         <w:t xml:space="preserve">3. Uso consciente y moderado: </w:t>
       </w:r>
       <w:r>
-        <w:t>La IA es un complemento; se prohíbe generar dependencia tecnológica que anule el esfuerzo cognitivo propio.</w:t>
+        <w:t>La IA es un complemento; se prohíbe generar dependencia que anule el esfuerzo cognitivo propio.</w:t>
       </w:r>
     </w:p>
     <w:p>
@@ -648,7 +648,7 @@
         <w:t xml:space="preserve">5. Verificación de limitaciones: </w:t>
       </w:r>
       <w:r>
-        <w:t>Asumir que la IA comete errores y alucina; verificar obligatoriamente toda información con fuentes académicas confiables.</w:t>
+        <w:t>Asumir que la IA comete errores y alucina; verificar obligatoriamente con fuentes confiables.</w:t>
       </w:r>
     </w:p>
     <w:p>
@@ -693,7 +693,7 @@
         <w:t xml:space="preserve">8. Responsabilidad personal: </w:t>
       </w:r>
       <w:r>
-        <w:t>El estudiante es el único responsable de la veracidad y calidad de todo documento entregado bajo su nombre.</w:t>
+        <w:t>El estudiante es el único responsable de la veracidad de todo documento entregado bajo su nombre.</w:t>
       </w:r>
     </w:p>
     <w:p>
@@ -723,7 +723,7 @@
         <w:t xml:space="preserve">10. Asistente, nunca sustituto: </w:t>
       </w:r>
       <w:r>
-        <w:t>La evaluación universitaria mide el aprendizaje del estudiante, no la capacidad del algoritmo.</w:t>
+        <w:t>La evaluación universitaria mide el aprendizaje humano, no la capacidad del algoritmo.</w:t>
       </w:r>
     </w:p>
     <w:p>
@@ -748,7 +748,7 @@
         <w:t xml:space="preserve">1. Cualificación permanente: </w:t>
       </w:r>
       <w:r>
-        <w:t>Participar activamente en los programas de formación en IA ofrecidos por la universidad.</w:t>
+        <w:t>Participar activamente en los programas de formación en IA de la universidad.</w:t>
       </w:r>
     </w:p>
     <w:p>
@@ -838,7 +838,7 @@
         <w:t xml:space="preserve">7. Ética y propiedad intelectual: </w:t>
       </w:r>
       <w:r>
-        <w:t>Proteger la autoría de guías y producciones estudiantiles, evitando subir contenidos a plataformas públicas sin salvaguardas.</w:t>
+        <w:t>Proteger la autoría de guías y producciones estudiantiles.</w:t>
       </w:r>
     </w:p>
     <w:p>
@@ -863,7 +863,7 @@
         <w:t xml:space="preserve">1. Capacitación continua: </w:t>
       </w:r>
       <w:r>
-        <w:t>Participar en programas de formación de IA orientados a la gestión y servicio universitario.</w:t>
+        <w:t>Participar en programas de formación de IA orientados al servicio universitario.</w:t>
       </w:r>
     </w:p>
     <w:p>
@@ -893,7 +893,7 @@
         <w:t xml:space="preserve">3. Optimización operativa: </w:t>
       </w:r>
       <w:r>
-        <w:t>Automatizar tareas rutinarias para destinar mayor tiempo a la atención humana y de calidad al usuario.</w:t>
+        <w:t>Automatizar tareas rutinarias para destinar mayor tiempo a la atención humana al usuario.</w:t>
       </w:r>
     </w:p>
     <w:p>
@@ -923,7 +923,7 @@
         <w:t xml:space="preserve">5. Deber de notificación: </w:t>
       </w:r>
       <w:r>
-        <w:t>Informar a los usuarios siempre que interactúen con agentes o respuestas automatizadas (chatbots).</w:t>
+        <w:t>Informar a los usuarios siempre que interactúen con agentes automatizados (chatbots).</w:t>
       </w:r>
     </w:p>
     <w:p>
@@ -953,7 +953,7 @@
         <w:t xml:space="preserve">7. Protección de datos (Ley 1581 de 2012): </w:t>
       </w:r>
       <w:r>
-        <w:t>Prohibición estricta de subir datos personales sensibles o financieros a herramientas de IA públicas.</w:t>
+        <w:t>Prohibición estricta de subir datos personales sensibles o financieros a herramientas públicas.</w:t>
       </w:r>
     </w:p>
     <w:p>
@@ -984,7 +984,7 @@
           <w:color w:val="102C57"/>
           <w:sz w:val="26"/>
         </w:rPr>
-        <w:t>5. Mecanismos de Gobernanza y Declaración Institucional</w:t>
+        <w:t>5. Mecanismos de Gobernanza Institucional</w:t>
       </w:r>
     </w:p>
     <w:p>
@@ -992,28 +992,7 @@
         <w:spacing w:line="276" w:lineRule="auto"/>
       </w:pPr>
       <w:r>
-        <w:t>Para asegurar la aplicación efectiva, la USC define una estructura de gobernanza articulada entre la Dirección General de Investigaciones (DGI), el Comité de Ética en Investigación, la Vicerrectoría Académica y la Dirección de Gestión de Informática y Telemática.</w:t>
-      </w:r>
-    </w:p>
-    <w:p>
-      <w:pPr>
-        <w:shd w:fill="F2F4F7"/>
-      </w:pPr>
-      <w:r>
-        <w:rPr>
-          <w:b/>
-        </w:rPr>
-        <w:t>Formato Institucional de Declaración de Asistencia de IA (Obligatorio en entregas académicas):</w:t>
-        <w:br/>
-      </w:r>
-      <w:r>
-        <w:t>• Herramienta(s) empleada(s): [Nombre del modelo / software, e.g. Claude 3.5 / ChatGPT 4o]</w:t>
-        <w:br/>
-        <w:t>• Propósito específico: [e.g. Corrección de estilo gramatical / Estructuración inicial de código]</w:t>
-        <w:br/>
-        <w:t>• Comandos / Prompts representativos: [Transcripción de las instrucciones dadas a la IA]</w:t>
-        <w:br/>
-        <w:t>• Declaración de autoría: "El autor declara que revisó, verificó y asume la responsabilidad total del contenido y las conclusiones expuestas en este trabajo."</w:t>
+        <w:t>La USC articula la Dirección General de Investigaciones (DGI), el Comité de Ética, la Vicerrectoría Académica y la Dirección de Gestión de Informática y Telemática para la vigilancia, actualización y soporte de estos lineamientos.</w:t>
       </w:r>
     </w:p>
     <w:p>
@@ -1029,7 +1008,516 @@
           <w:color w:val="102C57"/>
           <w:sz w:val="26"/>
         </w:rPr>
-        <w:t>6. Conclusiones y Conexión con el PETI</w:t>
+        <w:t>6. Caso Práctico: Declaración de Transparencia y Registro de Prompts del Proyecto PETI</w:t>
+      </w:r>
+    </w:p>
+    <w:p>
+      <w:pPr>
+        <w:spacing w:line="276" w:lineRule="auto"/>
+      </w:pPr>
+      <w:r>
+        <w:t>En cumplimiento del Artículo 3 (Directriz 6 Estudiantes y Directriz 5 Docentes), se presenta el registro detallado de las herramientas y comandos utilizados por los estudiantes en la construcción del PETI de Perficient Inc.:</w:t>
+      </w:r>
+    </w:p>
+    <w:p>
+      <w:pPr>
+        <w:spacing w:line="276" w:lineRule="auto"/>
+      </w:pPr>
+      <w:r>
+        <w:rPr>
+          <w:b/>
+        </w:rPr>
+        <w:t>Ficha Técnica del Uso de IA:</w:t>
+        <w:br/>
+      </w:r>
+      <w:r>
+        <w:t>• Modelos empleados: Claude 3.5 Sonnet (Anthropic) / Gemini 3.8 (Google)</w:t>
+        <w:br/>
+        <w:t>• Entornos de soporte: Claude Code CLI / Antigravity IDE / Scripts Python locales</w:t>
+        <w:br/>
+        <w:t>• Rol de la IA: Asistente de aceleración, estructuración matricial, verificación cruzada de normas MinTIC y maquetación Word.</w:t>
+        <w:br/>
+        <w:t>• Supervisión humana: 100% del criterio analítico, decisiones arquitecturales, revisión de evidencias y ajuste de cronogramas.</w:t>
+      </w:r>
+    </w:p>
+    <w:p/>
+    <w:tbl>
+      <w:tblPr>
+        <w:tblW w:type="auto" w:w="0"/>
+        <w:jc w:val="center"/>
+        <w:tblLook w:firstColumn="1" w:firstRow="1" w:lastColumn="0" w:lastRow="0" w:noHBand="0" w:noVBand="1" w:val="04A0"/>
+      </w:tblPr>
+      <w:tblGrid>
+        <w:gridCol w:w="2340"/>
+        <w:gridCol w:w="2340"/>
+        <w:gridCol w:w="2340"/>
+        <w:gridCol w:w="2340"/>
+      </w:tblGrid>
+      <w:tr>
+        <w:tc>
+          <w:tcPr>
+            <w:tcW w:type="dxa" w:w="2340"/>
+            <w:shd w:fill="102C57"/>
+          </w:tcPr>
+          <w:p>
+            <w:r>
+              <w:rPr>
+                <w:b/>
+                <w:color w:val="FFFFFF"/>
+                <w:sz w:val="18"/>
+              </w:rPr>
+              <w:t>Fase del Proyecto</w:t>
+            </w:r>
+          </w:p>
+        </w:tc>
+        <w:tc>
+          <w:tcPr>
+            <w:tcW w:type="dxa" w:w="2340"/>
+            <w:shd w:fill="102C57"/>
+          </w:tcPr>
+          <w:p>
+            <w:r>
+              <w:rPr>
+                <w:b/>
+                <w:color w:val="FFFFFF"/>
+                <w:sz w:val="18"/>
+              </w:rPr>
+              <w:t>Prompt / Comando Suministrado</w:t>
+            </w:r>
+          </w:p>
+        </w:tc>
+        <w:tc>
+          <w:tcPr>
+            <w:tcW w:type="dxa" w:w="2340"/>
+            <w:shd w:fill="102C57"/>
+          </w:tcPr>
+          <w:p>
+            <w:r>
+              <w:rPr>
+                <w:b/>
+                <w:color w:val="FFFFFF"/>
+                <w:sz w:val="18"/>
+              </w:rPr>
+              <w:t>Propósito Formativo</w:t>
+            </w:r>
+          </w:p>
+        </w:tc>
+        <w:tc>
+          <w:tcPr>
+            <w:tcW w:type="dxa" w:w="2340"/>
+            <w:shd w:fill="102C57"/>
+          </w:tcPr>
+          <w:p>
+            <w:r>
+              <w:rPr>
+                <w:b/>
+                <w:color w:val="FFFFFF"/>
+                <w:sz w:val="18"/>
+              </w:rPr>
+              <w:t>Resultado Obtenido</w:t>
+            </w:r>
+          </w:p>
+        </w:tc>
+      </w:tr>
+      <w:tr>
+        <w:tc>
+          <w:tcPr>
+            <w:tcW w:type="dxa" w:w="2340"/>
+          </w:tcPr>
+          <w:p>
+            <w:r>
+              <w:rPr>
+                <w:sz w:val="16"/>
+              </w:rPr>
+              <w:t>1. Ingesta y Contexto</w:t>
+            </w:r>
+          </w:p>
+        </w:tc>
+        <w:tc>
+          <w:tcPr>
+            <w:tcW w:type="dxa" w:w="2340"/>
+          </w:tcPr>
+          <w:p>
+            <w:r>
+              <w:rPr>
+                <w:sz w:val="16"/>
+              </w:rPr>
+              <w:t>"Lee y analiza toda la documentación del repositorio sobre Perficient y genera un plan referente a eso, usando toda tu potencia."</w:t>
+            </w:r>
+          </w:p>
+        </w:tc>
+        <w:tc>
+          <w:tcPr>
+            <w:tcW w:type="dxa" w:w="2340"/>
+          </w:tcPr>
+          <w:p>
+            <w:r>
+              <w:rPr>
+                <w:sz w:val="16"/>
+              </w:rPr>
+              <w:t>Comprensión del modelo operativo Nearshore, stack cloud y SGSI.</w:t>
+            </w:r>
+          </w:p>
+        </w:tc>
+        <w:tc>
+          <w:tcPr>
+            <w:tcW w:type="dxa" w:w="2340"/>
+          </w:tcPr>
+          <w:p>
+            <w:r>
+              <w:rPr>
+                <w:sz w:val="16"/>
+              </w:rPr>
+              <w:t>Resumen integral de insumos técnicos.</w:t>
+            </w:r>
+          </w:p>
+        </w:tc>
+      </w:tr>
+      <w:tr>
+        <w:tc>
+          <w:tcPr>
+            <w:tcW w:type="dxa" w:w="2340"/>
+            <w:shd w:fill="F7F9FB"/>
+          </w:tcPr>
+          <w:p>
+            <w:r>
+              <w:rPr>
+                <w:sz w:val="16"/>
+              </w:rPr>
+              <w:t>2. Arquitectura TO-BE</w:t>
+            </w:r>
+          </w:p>
+        </w:tc>
+        <w:tc>
+          <w:tcPr>
+            <w:tcW w:type="dxa" w:w="2340"/>
+            <w:shd w:fill="F7F9FB"/>
+          </w:tcPr>
+          <w:p>
+            <w:r>
+              <w:rPr>
+                <w:sz w:val="16"/>
+              </w:rPr>
+              <w:t>"Referente al último archivo de arquitectura y cronograma, genera el PETI usando como contexto los demás archivos del repositorio."</w:t>
+            </w:r>
+          </w:p>
+        </w:tc>
+        <w:tc>
+          <w:tcPr>
+            <w:tcW w:type="dxa" w:w="2340"/>
+            <w:shd w:fill="F7F9FB"/>
+          </w:tcPr>
+          <w:p>
+            <w:r>
+              <w:rPr>
+                <w:sz w:val="16"/>
+              </w:rPr>
+              <w:t>Diseñar la arquitectura empresarial en 5 capas TOGAF y fases 2026-2028.</w:t>
+            </w:r>
+          </w:p>
+        </w:tc>
+        <w:tc>
+          <w:tcPr>
+            <w:tcW w:type="dxa" w:w="2340"/>
+            <w:shd w:fill="F7F9FB"/>
+          </w:tcPr>
+          <w:p>
+            <w:r>
+              <w:rPr>
+                <w:sz w:val="16"/>
+              </w:rPr>
+              <w:t>Propuesta de arquitectura y cronograma semestral.</w:t>
+            </w:r>
+          </w:p>
+        </w:tc>
+      </w:tr>
+      <w:tr>
+        <w:tc>
+          <w:tcPr>
+            <w:tcW w:type="dxa" w:w="2340"/>
+          </w:tcPr>
+          <w:p>
+            <w:r>
+              <w:rPr>
+                <w:sz w:val="16"/>
+              </w:rPr>
+              <w:t>3. Referentes Oficiales</w:t>
+            </w:r>
+          </w:p>
+        </w:tc>
+        <w:tc>
+          <w:tcPr>
+            <w:tcW w:type="dxa" w:w="2340"/>
+          </w:tcPr>
+          <w:p>
+            <w:r>
+              <w:rPr>
+                <w:sz w:val="16"/>
+              </w:rPr>
+              <w:t>"Te voy a dar más contexto, meteré archivos que me dio mi profesor sobre el PETI en docs para que te contextualices más."</w:t>
+            </w:r>
+          </w:p>
+        </w:tc>
+        <w:tc>
+          <w:tcPr>
+            <w:tcW w:type="dxa" w:w="2340"/>
+          </w:tcPr>
+          <w:p>
+            <w:r>
+              <w:rPr>
+                <w:sz w:val="16"/>
+              </w:rPr>
+              <w:t>Incorporar referentes de MinCiencias y MinTIC provistos por el docente.</w:t>
+            </w:r>
+          </w:p>
+        </w:tc>
+        <w:tc>
+          <w:tcPr>
+            <w:tcW w:type="dxa" w:w="2340"/>
+          </w:tcPr>
+          <w:p>
+            <w:r>
+              <w:rPr>
+                <w:sz w:val="16"/>
+              </w:rPr>
+              <w:t>PETI v1.1 estructurado sobre el marco de referencia.</w:t>
+            </w:r>
+          </w:p>
+        </w:tc>
+      </w:tr>
+      <w:tr>
+        <w:tc>
+          <w:tcPr>
+            <w:tcW w:type="dxa" w:w="2340"/>
+            <w:shd w:fill="F7F9FB"/>
+          </w:tcPr>
+          <w:p>
+            <w:r>
+              <w:rPr>
+                <w:sz w:val="16"/>
+              </w:rPr>
+              <w:t>4. Auditoría de Norma</w:t>
+            </w:r>
+          </w:p>
+        </w:tc>
+        <w:tc>
+          <w:tcPr>
+            <w:tcW w:type="dxa" w:w="2340"/>
+            <w:shd w:fill="F7F9FB"/>
+          </w:tcPr>
+          <w:p>
+            <w:r>
+              <w:rPr>
+                <w:sz w:val="16"/>
+              </w:rPr>
+              <w:t>"Auditar conformidad frente a la Guía MinTIC MGGTI.GE.ES.01 v3.0 y la plantilla Anexo 2.docx" [Agente auditor-conformidad]</w:t>
+            </w:r>
+          </w:p>
+        </w:tc>
+        <w:tc>
+          <w:tcPr>
+            <w:tcW w:type="dxa" w:w="2340"/>
+            <w:shd w:fill="F7F9FB"/>
+          </w:tcPr>
+          <w:p>
+            <w:r>
+              <w:rPr>
+                <w:sz w:val="16"/>
+              </w:rPr>
+              <w:t>Verificar cumplimiento de los 16 numerales formales exigidos.</w:t>
+            </w:r>
+          </w:p>
+        </w:tc>
+        <w:tc>
+          <w:tcPr>
+            <w:tcW w:type="dxa" w:w="2340"/>
+            <w:shd w:fill="F7F9FB"/>
+          </w:tcPr>
+          <w:p>
+            <w:r>
+              <w:rPr>
+                <w:sz w:val="16"/>
+              </w:rPr>
+              <w:t>Detección de brechas y evolución a versión v2.1.</w:t>
+            </w:r>
+          </w:p>
+        </w:tc>
+      </w:tr>
+      <w:tr>
+        <w:tc>
+          <w:tcPr>
+            <w:tcW w:type="dxa" w:w="2340"/>
+          </w:tcPr>
+          <w:p>
+            <w:r>
+              <w:rPr>
+                <w:sz w:val="16"/>
+              </w:rPr>
+              <w:t>5. Trazabilidad Técnica</w:t>
+            </w:r>
+          </w:p>
+        </w:tc>
+        <w:tc>
+          <w:tcPr>
+            <w:tcW w:type="dxa" w:w="2340"/>
+          </w:tcPr>
+          <w:p>
+            <w:r>
+              <w:rPr>
+                <w:sz w:val="16"/>
+              </w:rPr>
+              <w:t>"python .claude/skills/trazabilidad-peti/scripts/verificar_trazabilidad.py"</w:t>
+            </w:r>
+          </w:p>
+        </w:tc>
+        <w:tc>
+          <w:tcPr>
+            <w:tcW w:type="dxa" w:w="2340"/>
+          </w:tcPr>
+          <w:p>
+            <w:r>
+              <w:rPr>
+                <w:sz w:val="16"/>
+              </w:rPr>
+              <w:t>Validar que cada brecha tenga proyectos, metas e indicadores asociados.</w:t>
+            </w:r>
+          </w:p>
+        </w:tc>
+        <w:tc>
+          <w:tcPr>
+            <w:tcW w:type="dxa" w:w="2340"/>
+          </w:tcPr>
+          <w:p>
+            <w:r>
+              <w:rPr>
+                <w:sz w:val="16"/>
+              </w:rPr>
+              <w:t>Verificación matemática de trazabilidad al 100%.</w:t>
+            </w:r>
+          </w:p>
+        </w:tc>
+      </w:tr>
+      <w:tr>
+        <w:tc>
+          <w:tcPr>
+            <w:tcW w:type="dxa" w:w="2340"/>
+            <w:shd w:fill="F7F9FB"/>
+          </w:tcPr>
+          <w:p>
+            <w:r>
+              <w:rPr>
+                <w:sz w:val="16"/>
+              </w:rPr>
+              <w:t>6. Maquetación Word</w:t>
+            </w:r>
+          </w:p>
+        </w:tc>
+        <w:tc>
+          <w:tcPr>
+            <w:tcW w:type="dxa" w:w="2340"/>
+            <w:shd w:fill="F7F9FB"/>
+          </w:tcPr>
+          <w:p>
+            <w:r>
+              <w:rPr>
+                <w:sz w:val="16"/>
+              </w:rPr>
+              <w:t>"python .claude/skills/guia-peti/scripts/md_a_docx.py docs/perficient_peti_v2... docs/PETI_...v2.1.docx"</w:t>
+            </w:r>
+          </w:p>
+        </w:tc>
+        <w:tc>
+          <w:tcPr>
+            <w:tcW w:type="dxa" w:w="2340"/>
+            <w:shd w:fill="F7F9FB"/>
+          </w:tcPr>
+          <w:p>
+            <w:r>
+              <w:rPr>
+                <w:sz w:val="16"/>
+              </w:rPr>
+              <w:t>Generar el entregable Word con la tipografía y tablas del MinTIC.</w:t>
+            </w:r>
+          </w:p>
+        </w:tc>
+        <w:tc>
+          <w:tcPr>
+            <w:tcW w:type="dxa" w:w="2340"/>
+            <w:shd w:fill="F7F9FB"/>
+          </w:tcPr>
+          <w:p>
+            <w:r>
+              <w:rPr>
+                <w:sz w:val="16"/>
+              </w:rPr>
+              <w:t>Archivo .docx oficial listo para presentación.</w:t>
+            </w:r>
+          </w:p>
+        </w:tc>
+      </w:tr>
+      <w:tr>
+        <w:tc>
+          <w:tcPr>
+            <w:tcW w:type="dxa" w:w="2340"/>
+          </w:tcPr>
+          <w:p>
+            <w:r>
+              <w:rPr>
+                <w:sz w:val="16"/>
+              </w:rPr>
+              <w:t>7. Normativa IA USC</w:t>
+            </w:r>
+          </w:p>
+        </w:tc>
+        <w:tc>
+          <w:tcPr>
+            <w:tcW w:type="dxa" w:w="2340"/>
+          </w:tcPr>
+          <w:p>
+            <w:r>
+              <w:rPr>
+                <w:sz w:val="16"/>
+              </w:rPr>
+              <w:t>"Busca si existe una plantilla de informe ejecutivo de lineamientos de la IA de la USC en internet y ahí genéralo."</w:t>
+            </w:r>
+          </w:p>
+        </w:tc>
+        <w:tc>
+          <w:tcPr>
+            <w:tcW w:type="dxa" w:w="2340"/>
+          </w:tcPr>
+          <w:p>
+            <w:r>
+              <w:rPr>
+                <w:sz w:val="16"/>
+              </w:rPr>
+              <w:t>Identificar directrices de la Circular DGI 001 y documentar el informe.</w:t>
+            </w:r>
+          </w:p>
+        </w:tc>
+        <w:tc>
+          <w:tcPr>
+            <w:tcW w:type="dxa" w:w="2340"/>
+          </w:tcPr>
+          <w:p>
+            <w:r>
+              <w:rPr>
+                <w:sz w:val="16"/>
+              </w:rPr>
+              <w:t>Redacción y compilación del presente Informe Ejecutivo.</w:t>
+            </w:r>
+          </w:p>
+        </w:tc>
+      </w:tr>
+    </w:tbl>
+    <w:p/>
+    <w:p>
+      <w:r>
+        <w:rPr>
+          <w:b/>
+        </w:rPr>
+        <w:t>Supervisión Humana y Corrección Crítica de Alucinaciones:</w:t>
+        <w:br/>
       </w:r>
     </w:p>
     <w:p>
@@ -1041,10 +1529,10 @@
         <w:rPr>
           <w:b/>
         </w:rPr>
-        <w:t xml:space="preserve">Alineación con Estándares Internacionales: </w:t>
+        <w:t xml:space="preserve">Corrección de Estado Corporativo (EQT): </w:t>
       </w:r>
       <w:r>
-        <w:t>La Circular Normativa DGI No. 001 refleja los principios rectores de la norma ISO/IEC 42001 (Sistema de Gestión de IA) y del marco NIST AI RMF, promoviendo la gobernanza proactiva.</w:t>
+        <w:t>El modelo asumía que Perficient cotizaba en bolsa (NASDAQ/SEC); la investigación de los estudiantes constató que en octubre de 2024 fue privatizada por el fondo EQT (Form 15-12G).</w:t>
       </w:r>
     </w:p>
     <w:p>
@@ -1056,10 +1544,10 @@
         <w:rPr>
           <w:b/>
         </w:rPr>
-        <w:t xml:space="preserve">Enfoque Formativo Superador: </w:t>
+        <w:t xml:space="preserve">Ajuste de Cronograma ISO 27001 a Mes 0: </w:t>
       </w:r>
       <w:r>
-        <w:t>La universidad abandona el paradigma prohibitivo e impulsa la alfabetización digital ética y el pensamiento crítico.</w:t>
+        <w:t>El modelo programó la renovación en la Fase 1 regular; la revisión humana identificó que vence en octubre/noviembre de 2026, obligando a adelantar la auditoría preparatoria a Mes 0.</w:t>
       </w:r>
     </w:p>
     <w:p>
@@ -1071,10 +1559,86 @@
         <w:rPr>
           <w:b/>
         </w:rPr>
-        <w:t xml:space="preserve">Conexión con el Proyecto PETI: </w:t>
+        <w:t xml:space="preserve">Anonimización de Cuentas Cliente: </w:t>
       </w:r>
       <w:r>
-        <w:t>Este informe demuestra cómo los controles planteados en el PETI de Perficient (AIMS, Policy-as-Code para agentes IA y protección de propiedad intelectual) coinciden plenamente con los lineamientos que la Universidad Santiago de Cali exige en su propio ecosistema educativo.</w:t>
+        <w:t>Los estudiantes suprimieron nombres de productos específicos de clientes analizados para proteger la confidencialidad (PRV-001).</w:t>
+      </w:r>
+    </w:p>
+    <w:p>
+      <w:pPr>
+        <w:shd w:fill="F2F4F7"/>
+      </w:pPr>
+      <w:r>
+        <w:rPr>
+          <w:b/>
+        </w:rPr>
+        <w:t>Declaración Formal de Autoría (Pacto Ético USC):</w:t>
+        <w:br/>
+      </w:r>
+      <w:r>
+        <w:t>"Los estudiantes integrantes del equipo de trabajo declaramos que el presente informe y el PETI de Perficient fueron elaborados bajo nuestra autoría intelectual y dirección técnica. Las herramientas de IA descritas fueron empleadas estrictamente como apoyo metodológico y de maquetación. Asumimos plena e indelegable responsabilidad sobre la exactitud, calidad técnica y conclusiones expuestas en este trabajo académico."</w:t>
+      </w:r>
+    </w:p>
+    <w:p>
+      <w:pPr>
+        <w:pBdr>
+          <w:bottom w:val="single" w:sz="8" w:space="4" w:color="8C1D40"/>
+        </w:pBdr>
+      </w:pPr>
+      <w:r>
+        <w:rPr>
+          <w:rFonts w:ascii="Calibri" w:hAnsi="Calibri"/>
+          <w:b/>
+          <w:color w:val="102C57"/>
+          <w:sz w:val="26"/>
+        </w:rPr>
+        <w:t>7. Conclusiones y Articulación con el PETI</w:t>
+      </w:r>
+    </w:p>
+    <w:p>
+      <w:pPr>
+        <w:pStyle w:val="ListBullet"/>
+        <w:spacing w:line="276" w:lineRule="auto"/>
+      </w:pPr>
+      <w:r>
+        <w:rPr>
+          <w:b/>
+        </w:rPr>
+        <w:t xml:space="preserve">Gobernanza en la Práctica: </w:t>
+      </w:r>
+      <w:r>
+        <w:t>Documentar los prompts y contrastar los resultados demuestra que la gobernanza de IA es una práctica activa de responsabilidad académica y profesional.</w:t>
+      </w:r>
+    </w:p>
+    <w:p>
+      <w:pPr>
+        <w:pStyle w:val="ListBullet"/>
+        <w:spacing w:line="276" w:lineRule="auto"/>
+      </w:pPr>
+      <w:r>
+        <w:rPr>
+          <w:b/>
+        </w:rPr>
+        <w:t xml:space="preserve">Alineación con Marcos Internacionales: </w:t>
+      </w:r>
+      <w:r>
+        <w:t>Las directrices de la Circular DGI No. 001 coinciden directamente con la norma ISO/IEC 42001 y el marco NIST AI RMF incorporados en el PETI de Perficient.</w:t>
+      </w:r>
+    </w:p>
+    <w:p>
+      <w:pPr>
+        <w:pStyle w:val="ListBullet"/>
+        <w:spacing w:line="276" w:lineRule="auto"/>
+      </w:pPr>
+      <w:r>
+        <w:rPr>
+          <w:b/>
+        </w:rPr>
+        <w:t xml:space="preserve">Formación Integral: </w:t>
+      </w:r>
+      <w:r>
+        <w:t>El uso transparente y ético de la IA prepara a los futuros ingenieros de sistemas de la USC para liderar entornos tecnológicos complejos y regulados.</w:t>
       </w:r>
     </w:p>
     <w:sectPr>

</xml_diff>